<commit_message>
Tribune Dutreil v7 : arbitrages Carrez intégrés
Historique renforcé (UPSA, pactes Migaud-Gattaz, chronologie 1999/2003/2005,
frise des alternances), nouveau titre de la version longue axé continuité,
clause de grand-père musclée (contrat qui oblige les deux parties, taux
maintenu pour les nouveaux pactes), précision « au décès » dans l'exemple.

Co-Authored-By: Claude Fable 5 <noreply@anthropic.com>
Claude-Session: https://claude.ai/code/session_01EismpbntstLAG4woJnWJbX
</commit_message>
<xml_diff>
--- a/livrables/Tribune-Dutreil-Carrez/Tribune-Dutreil_Version-courte_4000-signes.docx
+++ b/livrables/Tribune-Dutreil-Carrez/Tribune-Dutreil_Version-courte_4000-signes.docx
@@ -18,7 +18,7 @@
           <w:sz w:val="18"/>
           <w:szCs w:val="18"/>
         </w:rPr>
-        <w:t xml:space="preserve">Projet de tribune, cosignature Gilles Carrez / François Ouairy. Version courte ~4 000 signes. Les passages entre crochets sont à votre main. Version 6 du 3 septembre 2026.</w:t>
+        <w:t xml:space="preserve">Projet de tribune, cosignature Gilles Carrez / François Ouairy. Version courte ~4 500 signes. Les passages entre crochets sont à votre main. Version 7 du 4 septembre 2026.</w:t>
       </w:r>
     </w:p>
     <w:p>
@@ -94,7 +94,7 @@
           <w:sz w:val="24"/>
           <w:szCs w:val="24"/>
         </w:rPr>
-        <w:t xml:space="preserve">Rappelons d'où vient le pacte. Dès 1994, la Commission européenne constatait que des milliers d'entreprises disparaissaient chaque année en Europe, avec leurs emplois, faute d'avoir passé le cap d'une génération, et désignait le droit fiscal parmi les causes. La France taxait alors la transmission en ligne directe jusqu'à 40 %, et à peine une entreprise sur cinq restait familiale, contre plus d'une sur deux en Allemagne. Concrètement, pour une entreprise valorisée vingt millions d'euros et un enfant repreneur, les droits sans pacte sont de l'ordre de huit millions d'euros. Avec un pacte, autour de deux. Personne n'a huit millions sur un compte courant. On emprunte, on ponctionne la trésorerie, ou on vend. Le régime existe pour fermer cette impasse, en échange d'années de conservation des titres et de direction effective.</w:t>
+        <w:t xml:space="preserve">Rappelons d'où vient le pacte. En 1994, le laboratoire UPSA, fleuron familial d'Agen, passait sous pavillon américain cinq ans après la mort de son dirigeant, droits de succession et ISF aidant. La France taxait alors la ligne directe jusqu'à 40 %, et à peine une entreprise sur cinq restait familiale, contre plus d'une sur deux en Allemagne. Yvon Gattaz conçoit alors le pacte d'actionnaires ; Didier Migaud, rapporteur général socialiste, l'inscrit dans la loi de finances pour 2000, un abattement de 50 % sur les successions en échange d'un engagement de conservation. La loi Dutreil de 2003 l'étend aux donations, la loi PME du 2 août 2005 porte l'abattement à 75 %. Créé sous un gouvernement de gauche, étendu et porté à 75 % par la droite, jamais remis en cause depuis. Concrètement, pour une entreprise valorisée vingt millions d'euros et un enfant repreneur, les droits au décès, sans pacte, sont de l'ordre de huit millions d'euros. Avec un pacte, autour de deux. Personne n'a huit millions sur un compte courant. On emprunte, on ponctionne la trésorerie, ou on vend.</w:t>
       </w:r>
     </w:p>
     <w:p>
@@ -151,7 +151,7 @@
           <w:sz w:val="24"/>
           <w:szCs w:val="24"/>
         </w:rPr>
-        <w:t xml:space="preserve">Que faire ? D'abord ce que les fiscalistes appellent une clause de grand-père. Les règles en vigueur au jour de la signature valent jusqu'au terme du pacte. Cela ne coûte rien au budget. Ensuite, achever le ciblage. La loi écarte désormais de l'exonération les résidences, les yachts ou les œuvres d'art logés dans les sociétés. Elle ne dit toujours rien de la trésorerie de placement ni de l'immobilier de rapport. Le même mécanisme, étendu à ces actifs, donnerait au régime sa forme aboutie, 75 % sans plafond pour l'outil professionnel, rien pour le reste. Ce ciblage rapporterait plus qu'un rabot, qui toucherait d'abord les PME. Et une évaluation publique tous les trois ans, chiffres sur la table, seule occasion de retoucher le régime. Entre deux rendez-vous, le régime ne bouge pas.</w:t>
+        <w:t xml:space="preserve">Que faire ? D'abord ce que les fiscalistes appellent une clause de grand-père. Un pacte signé est un contrat, et un contrat oblige les deux parties. Les familles tiennent huit ans ; l'État tient les règles en vigueur au jour de la signature, jusqu'au terme. Cela ne coûte rien au budget. Pour les pactes nouveaux, la loi fixe ses conditions, taux de 75 % maintenu. Ensuite, achever le ciblage. La loi écarte désormais de l'exonération les résidences, les yachts ou les œuvres d'art logés dans les sociétés. Elle ne dit toujours rien de la trésorerie de placement ni de l'immobilier de rapport. Le même mécanisme, étendu à ces actifs, donnerait au régime sa forme aboutie, 75 % sans plafond pour l'outil professionnel, rien pour le reste. Ce ciblage rapporterait plus qu'un rabot, qui toucherait d'abord les PME. Et une évaluation publique tous les trois ans, chiffres sur la table, seule occasion de retoucher le régime. Entre deux rendez-vous, le régime ne bouge pas.</w:t>
       </w:r>
     </w:p>
     <w:p>

</xml_diff>

<commit_message>
Tribune Dutreil v8 : titre unique « Pacte Dutreil : ni rabot ni statu quo »
Titre de Gilles Carrez appliqué aux deux versions, double refus défendu en
tête des propositions, ligne huit ans/huit mois réinjectée dans la courte,
piste Zucman écartée.

Co-Authored-By: Claude Fable 5 <noreply@anthropic.com>
Claude-Session: https://claude.ai/code/session_01EismpbntstLAG4woJnWJbX
</commit_message>
<xml_diff>
--- a/livrables/Tribune-Dutreil-Carrez/Tribune-Dutreil_Version-courte_4000-signes.docx
+++ b/livrables/Tribune-Dutreil-Carrez/Tribune-Dutreil_Version-courte_4000-signes.docx
@@ -18,7 +18,7 @@
           <w:sz w:val="18"/>
           <w:szCs w:val="18"/>
         </w:rPr>
-        <w:t xml:space="preserve">Projet de tribune, cosignature Gilles Carrez / François Ouairy. Version courte ~4 500 signes. Les passages entre crochets sont à votre main. Version 7 du 4 septembre 2026.</w:t>
+        <w:t xml:space="preserve">Projet de tribune, cosignature Gilles Carrez / François Ouairy. Version courte ~4 500 signes. Les passages entre crochets sont à votre main. Version 8 du 4 septembre 2026.</w:t>
       </w:r>
     </w:p>
     <w:p>
@@ -37,7 +37,7 @@
           <w:sz w:val="28"/>
           <w:szCs w:val="28"/>
         </w:rPr>
-        <w:t xml:space="preserve">Le pacte Dutreil exige huit ans des familles. L'État, lui, ne tient pas huit mois.</w:t>
+        <w:t xml:space="preserve">Pacte Dutreil : ni rabot ni statu quo</w:t>
       </w:r>
     </w:p>
     <w:p>
@@ -132,26 +132,26 @@
           <w:sz w:val="24"/>
           <w:szCs w:val="24"/>
         </w:rPr>
-        <w:t xml:space="preserve">Le vrai problème est plus bête. Les règles ne tiennent pas en place. Un pacte signé aujourd'hui court jusqu'en 2034 ; d'ici là, huit lois de finances, des doctrines administratives qui bougent, les contours encore discutés de la holding animatrice, cette société de tête dont dépend l'accès au régime pour des milliers de groupes familiaux. Chaque automne, un plafond circule, un amendement surgit, une suppression se vote en commission avant de disparaître en séance. Les familles, elles, restent engagées.</w:t>
-      </w:r>
-    </w:p>
-    <w:p>
-      <w:pPr>
-        <w:spacing w:after="200" w:before="0" w:line="360"/>
-        <w:jc w:val="both"/>
-      </w:pPr>
-      <w:r>
-        <w:rPr>
-          <w:rFonts w:ascii="Times New Roman" w:cs="Times New Roman" w:eastAsia="Times New Roman" w:hAnsi="Times New Roman"/>
-          <w:b w:val="false"/>
-          <w:bCs w:val="false"/>
-          <w:i w:val="false"/>
-          <w:iCs w:val="false"/>
-          <w:color w:val="000000"/>
-          <w:sz w:val="24"/>
-          <w:szCs w:val="24"/>
-        </w:rPr>
-        <w:t xml:space="preserve">Que faire ? D'abord ce que les fiscalistes appellent une clause de grand-père. Un pacte signé est un contrat, et un contrat oblige les deux parties. Les familles tiennent huit ans ; l'État tient les règles en vigueur au jour de la signature, jusqu'au terme. Cela ne coûte rien au budget. Pour les pactes nouveaux, la loi fixe ses conditions, taux de 75 % maintenu. Ensuite, achever le ciblage. La loi écarte désormais de l'exonération les résidences, les yachts ou les œuvres d'art logés dans les sociétés. Elle ne dit toujours rien de la trésorerie de placement ni de l'immobilier de rapport. Le même mécanisme, étendu à ces actifs, donnerait au régime sa forme aboutie, 75 % sans plafond pour l'outil professionnel, rien pour le reste. Ce ciblage rapporterait plus qu'un rabot, qui toucherait d'abord les PME. Et une évaluation publique tous les trois ans, chiffres sur la table, seule occasion de retoucher le régime. Entre deux rendez-vous, le régime ne bouge pas.</w:t>
+        <w:t xml:space="preserve">Le vrai problème est plus bête. Les règles ne tiennent pas en place. Un pacte signé aujourd'hui court jusqu'en 2034 ; d'ici là, huit lois de finances, des doctrines administratives qui bougent, les contours encore discutés de la holding animatrice, cette société de tête dont dépend l'accès au régime pour des milliers de groupes familiaux. Chaque automne, un plafond circule, un amendement surgit, une suppression se vote en commission avant de disparaître en séance. Les familles, elles, restent engagées. On leur demande de tenir huit ans ; la règle fiscale ne tient pas huit mois.</w:t>
+      </w:r>
+    </w:p>
+    <w:p>
+      <w:pPr>
+        <w:spacing w:after="200" w:before="0" w:line="360"/>
+        <w:jc w:val="both"/>
+      </w:pPr>
+      <w:r>
+        <w:rPr>
+          <w:rFonts w:ascii="Times New Roman" w:cs="Times New Roman" w:eastAsia="Times New Roman" w:hAnsi="Times New Roman"/>
+          <w:b w:val="false"/>
+          <w:bCs w:val="false"/>
+          <w:i w:val="false"/>
+          <w:iCs w:val="false"/>
+          <w:color w:val="000000"/>
+          <w:sz w:val="24"/>
+          <w:szCs w:val="24"/>
+        </w:rPr>
+        <w:t xml:space="preserve">Que faire ? Ni rabot, ni statu quo. Le premier punirait les PME sans fermer un seul montage, le second laisserait prospérer ce que la Cour documente. D'abord, ce que les fiscalistes appellent une clause de grand-père. Un pacte signé est un contrat, et un contrat oblige les deux parties. Les familles tiennent huit ans ; l'État tient les règles en vigueur au jour de la signature, jusqu'au terme. Cela ne coûte rien au budget. Pour les pactes nouveaux, la loi fixe ses conditions, taux de 75 % maintenu. Ensuite, achever le ciblage. La loi écarte désormais de l'exonération les résidences, les yachts ou les œuvres d'art logés dans les sociétés. Elle ne dit toujours rien de la trésorerie de placement ni de l'immobilier de rapport. Le même mécanisme, étendu à ces actifs, donnerait au régime sa forme aboutie, 75 % sans plafond pour l'outil professionnel, rien pour le reste. Ce ciblage rapporterait plus qu'un rabot. Et une évaluation publique tous les trois ans, chiffres sur la table, seule occasion de retoucher le régime. Entre deux rendez-vous, le régime ne bouge pas.</w:t>
       </w:r>
     </w:p>
     <w:p>

</xml_diff>

<commit_message>
Tribune Dutreil v9 : style simple et accessible
Vraies phrases partout (frise des alternances réécrite, appositions sans
verbe supprimées), sujets explicites à la place de « on », « entreprises
familiales » au lieu de « patrimoniales ».

Co-Authored-By: Claude Fable 5 <noreply@anthropic.com>
Claude-Session: https://claude.ai/code/session_01EismpbntstLAG4woJnWJbX
</commit_message>
<xml_diff>
--- a/livrables/Tribune-Dutreil-Carrez/Tribune-Dutreil_Version-courte_4000-signes.docx
+++ b/livrables/Tribune-Dutreil-Carrez/Tribune-Dutreil_Version-courte_4000-signes.docx
@@ -18,7 +18,7 @@
           <w:sz w:val="18"/>
           <w:szCs w:val="18"/>
         </w:rPr>
-        <w:t xml:space="preserve">Projet de tribune, cosignature Gilles Carrez / François Ouairy. Version courte ~4 500 signes. Les passages entre crochets sont à votre main. Version 8 du 4 septembre 2026.</w:t>
+        <w:t xml:space="preserve">Projet de tribune, cosignature Gilles Carrez / François Ouairy. Version courte ~4 500 signes. Les passages entre crochets sont à votre main. Version 9 du 4 septembre 2026.</w:t>
       </w:r>
     </w:p>
     <w:p>
@@ -94,64 +94,64 @@
           <w:sz w:val="24"/>
           <w:szCs w:val="24"/>
         </w:rPr>
-        <w:t xml:space="preserve">Rappelons d'où vient le pacte. En 1994, le laboratoire UPSA, fleuron familial d'Agen, passait sous pavillon américain cinq ans après la mort de son dirigeant, droits de succession et ISF aidant. La France taxait alors la ligne directe jusqu'à 40 %, et à peine une entreprise sur cinq restait familiale, contre plus d'une sur deux en Allemagne. Yvon Gattaz conçoit alors le pacte d'actionnaires ; Didier Migaud, rapporteur général socialiste, l'inscrit dans la loi de finances pour 2000, un abattement de 50 % sur les successions en échange d'un engagement de conservation. La loi Dutreil de 2003 l'étend aux donations, la loi PME du 2 août 2005 porte l'abattement à 75 %. Créé sous un gouvernement de gauche, étendu et porté à 75 % par la droite, jamais remis en cause depuis. Concrètement, pour une entreprise valorisée vingt millions d'euros et un enfant repreneur, les droits au décès, sans pacte, sont de l'ordre de huit millions d'euros. Avec un pacte, autour de deux. Personne n'a huit millions sur un compte courant. On emprunte, on ponctionne la trésorerie, ou on vend.</w:t>
-      </w:r>
-    </w:p>
-    <w:p>
-      <w:pPr>
-        <w:spacing w:after="200" w:before="0" w:line="360"/>
-        <w:jc w:val="both"/>
-      </w:pPr>
-      <w:r>
-        <w:rPr>
-          <w:rFonts w:ascii="Times New Roman" w:cs="Times New Roman" w:eastAsia="Times New Roman" w:hAnsi="Times New Roman"/>
-          <w:b w:val="false"/>
-          <w:bCs w:val="false"/>
-          <w:i w:val="false"/>
-          <w:iCs w:val="false"/>
-          <w:color w:val="000000"/>
-          <w:sz w:val="24"/>
-          <w:szCs w:val="24"/>
-        </w:rPr>
-        <w:t xml:space="preserve">Le législateur vient encore de durcir l'exercice. Engagement porté à huit ans au total, exclusion de l'assiette des résidences, yachts et autres biens de confort logés dans les sociétés. Ces règles ont quelques mois. Personne n'en a mesuré les effets. En écrire de nouvelles dès cet automne, c'est légiférer à l'aveugle.</w:t>
-      </w:r>
-    </w:p>
-    <w:p>
-      <w:pPr>
-        <w:spacing w:after="200" w:before="0" w:line="360"/>
-        <w:jc w:val="both"/>
-      </w:pPr>
-      <w:r>
-        <w:rPr>
-          <w:rFonts w:ascii="Times New Roman" w:cs="Times New Roman" w:eastAsia="Times New Roman" w:hAnsi="Times New Roman"/>
-          <w:b w:val="false"/>
-          <w:bCs w:val="false"/>
-          <w:i w:val="false"/>
-          <w:iCs w:val="false"/>
-          <w:color w:val="000000"/>
-          <w:sz w:val="24"/>
-          <w:szCs w:val="24"/>
-        </w:rPr>
-        <w:t xml:space="preserve">Le vrai problème est plus bête. Les règles ne tiennent pas en place. Un pacte signé aujourd'hui court jusqu'en 2034 ; d'ici là, huit lois de finances, des doctrines administratives qui bougent, les contours encore discutés de la holding animatrice, cette société de tête dont dépend l'accès au régime pour des milliers de groupes familiaux. Chaque automne, un plafond circule, un amendement surgit, une suppression se vote en commission avant de disparaître en séance. Les familles, elles, restent engagées. On leur demande de tenir huit ans ; la règle fiscale ne tient pas huit mois.</w:t>
-      </w:r>
-    </w:p>
-    <w:p>
-      <w:pPr>
-        <w:spacing w:after="200" w:before="0" w:line="360"/>
-        <w:jc w:val="both"/>
-      </w:pPr>
-      <w:r>
-        <w:rPr>
-          <w:rFonts w:ascii="Times New Roman" w:cs="Times New Roman" w:eastAsia="Times New Roman" w:hAnsi="Times New Roman"/>
-          <w:b w:val="false"/>
-          <w:bCs w:val="false"/>
-          <w:i w:val="false"/>
-          <w:iCs w:val="false"/>
-          <w:color w:val="000000"/>
-          <w:sz w:val="24"/>
-          <w:szCs w:val="24"/>
-        </w:rPr>
-        <w:t xml:space="preserve">Que faire ? Ni rabot, ni statu quo. Le premier punirait les PME sans fermer un seul montage, le second laisserait prospérer ce que la Cour documente. D'abord, ce que les fiscalistes appellent une clause de grand-père. Un pacte signé est un contrat, et un contrat oblige les deux parties. Les familles tiennent huit ans ; l'État tient les règles en vigueur au jour de la signature, jusqu'au terme. Cela ne coûte rien au budget. Pour les pactes nouveaux, la loi fixe ses conditions, taux de 75 % maintenu. Ensuite, achever le ciblage. La loi écarte désormais de l'exonération les résidences, les yachts ou les œuvres d'art logés dans les sociétés. Elle ne dit toujours rien de la trésorerie de placement ni de l'immobilier de rapport. Le même mécanisme, étendu à ces actifs, donnerait au régime sa forme aboutie, 75 % sans plafond pour l'outil professionnel, rien pour le reste. Ce ciblage rapporterait plus qu'un rabot. Et une évaluation publique tous les trois ans, chiffres sur la table, seule occasion de retoucher le régime. Entre deux rendez-vous, le régime ne bouge pas.</w:t>
+        <w:t xml:space="preserve">Rappelons d'où vient le pacte. En 1994, le laboratoire UPSA, fleuron familial d'Agen, passait sous pavillon américain cinq ans après la mort de son dirigeant, droits de succession et ISF aidant. La France taxait alors la ligne directe jusqu'à 40 %, et à peine une entreprise sur cinq restait familiale, contre plus d'une sur deux en Allemagne. Yvon Gattaz conçoit alors le pacte d'actionnaires ; Didier Migaud, rapporteur général socialiste, l'inscrit dans la loi de finances pour 2000, un abattement de 50 % sur les successions en échange d'un engagement de conservation. La loi Dutreil de 2003 l'étend aux donations, la loi PME du 2 août 2005 porte l'abattement à 75 %. Le dispositif a été créé sous un gouvernement de gauche, puis étendu et porté à 75 % par la droite. Personne ne l'a remis en cause depuis. Concrètement, pour une entreprise valorisée vingt millions d'euros et un enfant repreneur, les droits au décès, sans pacte, sont de l'ordre de huit millions d'euros. Avec un pacte, ils retombent autour de deux millions. Personne n'a huit millions sur un compte courant. Les héritiers empruntent, ponctionnent la trésorerie, ou vendent.</w:t>
+      </w:r>
+    </w:p>
+    <w:p>
+      <w:pPr>
+        <w:spacing w:after="200" w:before="0" w:line="360"/>
+        <w:jc w:val="both"/>
+      </w:pPr>
+      <w:r>
+        <w:rPr>
+          <w:rFonts w:ascii="Times New Roman" w:cs="Times New Roman" w:eastAsia="Times New Roman" w:hAnsi="Times New Roman"/>
+          <w:b w:val="false"/>
+          <w:bCs w:val="false"/>
+          <w:i w:val="false"/>
+          <w:iCs w:val="false"/>
+          <w:color w:val="000000"/>
+          <w:sz w:val="24"/>
+          <w:szCs w:val="24"/>
+        </w:rPr>
+        <w:t xml:space="preserve">Le législateur vient encore de durcir l'exercice. L'engagement est porté à huit ans au total, et les résidences, yachts et autres biens de confort logés dans les sociétés sortent de l'assiette exonérée. Ces règles ont quelques mois. Personne n'en a mesuré les effets. En écrire de nouvelles dès cet automne, c'est légiférer à l'aveugle.</w:t>
+      </w:r>
+    </w:p>
+    <w:p>
+      <w:pPr>
+        <w:spacing w:after="200" w:before="0" w:line="360"/>
+        <w:jc w:val="both"/>
+      </w:pPr>
+      <w:r>
+        <w:rPr>
+          <w:rFonts w:ascii="Times New Roman" w:cs="Times New Roman" w:eastAsia="Times New Roman" w:hAnsi="Times New Roman"/>
+          <w:b w:val="false"/>
+          <w:bCs w:val="false"/>
+          <w:i w:val="false"/>
+          <w:iCs w:val="false"/>
+          <w:color w:val="000000"/>
+          <w:sz w:val="24"/>
+          <w:szCs w:val="24"/>
+        </w:rPr>
+        <w:t xml:space="preserve">Le vrai problème est plus bête. Les règles ne tiennent pas en place. Un pacte signé aujourd'hui court jusqu'en 2034 ; d'ici là, huit lois de finances, des doctrines administratives qui bougent, les contours encore discutés de la holding animatrice, cette société de tête dont dépend l'accès au régime pour des milliers de groupes familiaux. Chaque automne, un plafond circule, un amendement surgit, une suppression se vote en commission avant de disparaître en séance. Les familles, elles, restent engagées. L'État leur demande de tenir huit ans ; la règle fiscale ne tient pas huit mois.</w:t>
+      </w:r>
+    </w:p>
+    <w:p>
+      <w:pPr>
+        <w:spacing w:after="200" w:before="0" w:line="360"/>
+        <w:jc w:val="both"/>
+      </w:pPr>
+      <w:r>
+        <w:rPr>
+          <w:rFonts w:ascii="Times New Roman" w:cs="Times New Roman" w:eastAsia="Times New Roman" w:hAnsi="Times New Roman"/>
+          <w:b w:val="false"/>
+          <w:bCs w:val="false"/>
+          <w:i w:val="false"/>
+          <w:iCs w:val="false"/>
+          <w:color w:val="000000"/>
+          <w:sz w:val="24"/>
+          <w:szCs w:val="24"/>
+        </w:rPr>
+        <w:t xml:space="preserve">Que faire ? Il ne faut ni raboter ni sanctuariser. Le rabot punirait les PME sans fermer un seul montage ; le statu quo laisserait prospérer ce que la Cour documente. D'abord, ce que les fiscalistes appellent une clause de grand-père. Un pacte signé est un contrat, et un contrat oblige les deux parties. Les familles tiennent huit ans ; l'État tient les règles en vigueur au jour de la signature, jusqu'au terme. Cela ne coûte rien au budget. Pour les pactes nouveaux, la loi fixe ses conditions et le taux de 75 % est maintenu. Ensuite, achever le ciblage. La loi écarte désormais de l'exonération les résidences, les yachts ou les œuvres d'art logés dans les sociétés. Elle ne dit toujours rien de la trésorerie de placement ni de l'immobilier de rapport. Le même mécanisme, étendu à ces actifs, donnerait au régime sa forme aboutie, 75 % sans plafond pour l'outil professionnel, rien pour le reste. Ce ciblage rapporterait plus qu'un rabot. Et une évaluation publique tous les trois ans, chiffres sur la table, seule occasion de retoucher le régime. Entre deux rendez-vous, le régime ne bouge pas.</w:t>
       </w:r>
     </w:p>
     <w:p>

</xml_diff>

<commit_message>
Tribune Dutreil v10 : précisions du relecteur
LF du 19 février 2026 nommée, exclusion reformulée en fraction de valeur des
biens étrangers à l'exploitation, généalogie Gattaz-Migaud sourcée et
prudente (défendent l'idée, surnom d'époque), « peu d'héritiers disposent »
dans la version longue.

Co-Authored-By: Claude Fable 5 <noreply@anthropic.com>
Claude-Session: https://claude.ai/code/session_01EismpbntstLAG4woJnWJbX
</commit_message>
<xml_diff>
--- a/livrables/Tribune-Dutreil-Carrez/Tribune-Dutreil_Version-courte_4000-signes.docx
+++ b/livrables/Tribune-Dutreil-Carrez/Tribune-Dutreil_Version-courte_4000-signes.docx
@@ -18,7 +18,7 @@
           <w:sz w:val="18"/>
           <w:szCs w:val="18"/>
         </w:rPr>
-        <w:t xml:space="preserve">Projet de tribune, cosignature Gilles Carrez / François Ouairy. Version courte. Les passages entre crochets sont à votre main. Version 9 du 4 septembre 2026.</w:t>
+        <w:t xml:space="preserve">Projet de tribune, cosignature Gilles Carrez / François Ouairy. Version courte. Les passages entre crochets sont à votre main. Version 10 du 4 septembre 2026.</w:t>
       </w:r>
     </w:p>
     <w:p>
@@ -94,26 +94,26 @@
           <w:sz w:val="24"/>
           <w:szCs w:val="24"/>
         </w:rPr>
-        <w:t xml:space="preserve">Rappelons d'où vient le pacte. En 1994, le laboratoire UPSA, fleuron familial d'Agen, passait sous pavillon américain cinq ans après la mort de son dirigeant, droits de succession et ISF aidant. La France taxait alors la ligne directe jusqu'à 40 %, et à peine une entreprise sur cinq restait familiale, contre plus d'une sur deux en Allemagne. Yvon Gattaz conçoit alors le pacte d'actionnaires ; Didier Migaud, rapporteur général socialiste, l'inscrit dans la loi de finances pour 2000, un abattement de 50 % sur les successions en échange d'un engagement de conservation. La loi Dutreil de 2003 l'étend aux donations, la loi PME du 2 août 2005 porte l'abattement à 75 %. Le dispositif a été créé sous un gouvernement de gauche, puis étendu et porté à 75 % par la droite. Personne ne l'a remis en cause depuis. Concrètement, pour une entreprise valorisée vingt millions d'euros et un enfant repreneur, les droits au décès, sans pacte, sont de l'ordre de huit millions d'euros. Avec un pacte, ils retombent autour de deux millions. Personne n'a huit millions sur un compte courant. Les héritiers empruntent, ponctionnent la trésorerie, ou vendent.</w:t>
-      </w:r>
-    </w:p>
-    <w:p>
-      <w:pPr>
-        <w:spacing w:after="200" w:before="0" w:line="360"/>
-        <w:jc w:val="both"/>
-      </w:pPr>
-      <w:r>
-        <w:rPr>
-          <w:rFonts w:ascii="Times New Roman" w:cs="Times New Roman" w:eastAsia="Times New Roman" w:hAnsi="Times New Roman"/>
-          <w:b w:val="false"/>
-          <w:bCs w:val="false"/>
-          <w:i w:val="false"/>
-          <w:iCs w:val="false"/>
-          <w:color w:val="000000"/>
-          <w:sz w:val="24"/>
-          <w:szCs w:val="24"/>
-        </w:rPr>
-        <w:t xml:space="preserve">Le législateur vient encore de durcir l'exercice. L'engagement est porté à huit ans au total, et les résidences, yachts et autres biens de confort logés dans les sociétés sortent de l'assiette exonérée. Ces règles ont quelques mois. Personne n'en a mesuré les effets. En écrire de nouvelles dès cet automne, c'est légiférer à l'aveugle.</w:t>
+        <w:t xml:space="preserve">Rappelons d'où vient le pacte. En 1994, le laboratoire UPSA, fleuron familial d'Agen, passait sous pavillon américain cinq ans après la mort de son dirigeant, droits de succession et ISF aidant. La France taxait alors la ligne directe jusqu'à 40 %, et à peine une entreprise sur cinq restait familiale, contre plus d'une sur deux en Allemagne. Yvon Gattaz et les entreprises familiales défendent alors l'idée d'un pacte d'actionnaires ; Didier Migaud, rapporteur général socialiste, la fait entrer dans la loi de finances pour 2000 par amendement, avec un abattement de 50 % sur les successions en échange d'un engagement de conservation. La loi Dutreil de 2003 l'étend aux donations, la loi PME du 2 août 2005 porte l'abattement à 75 %. Le dispositif a été créé sous un gouvernement de gauche, puis étendu et porté à 75 % par la droite. Personne ne l'a remis en cause depuis. Concrètement, pour une entreprise valorisée vingt millions d'euros et un enfant repreneur, les droits au décès, sans pacte, sont de l'ordre de huit millions d'euros. Avec un pacte, ils retombent autour de deux millions. Personne n'a huit millions sur un compte courant. Les héritiers empruntent, ponctionnent la trésorerie, ou vendent.</w:t>
+      </w:r>
+    </w:p>
+    <w:p>
+      <w:pPr>
+        <w:spacing w:after="200" w:before="0" w:line="360"/>
+        <w:jc w:val="both"/>
+      </w:pPr>
+      <w:r>
+        <w:rPr>
+          <w:rFonts w:ascii="Times New Roman" w:cs="Times New Roman" w:eastAsia="Times New Roman" w:hAnsi="Times New Roman"/>
+          <w:b w:val="false"/>
+          <w:bCs w:val="false"/>
+          <w:i w:val="false"/>
+          <w:iCs w:val="false"/>
+          <w:color w:val="000000"/>
+          <w:sz w:val="24"/>
+          <w:szCs w:val="24"/>
+        </w:rPr>
+        <w:t xml:space="preserve">La loi de finances du 19 février 2026 a encore durci l'exercice. L'engagement est porté à huit ans au total, et la fraction de valeur correspondant notamment aux résidences, yachts ou œuvres d'art étrangers à l'exploitation sort désormais de l'assiette exonérée. Ces règles ont quelques mois. Personne n'en a mesuré les effets. En écrire de nouvelles dès cet automne, c'est légiférer à l'aveugle.</w:t>
       </w:r>
     </w:p>
     <w:p>
@@ -151,7 +151,7 @@
           <w:sz w:val="24"/>
           <w:szCs w:val="24"/>
         </w:rPr>
-        <w:t xml:space="preserve">Que faire ? Il ne faut ni raboter ni sanctuariser. Le rabot punirait les PME sans fermer un seul montage ; le statu quo laisserait prospérer ce que la Cour documente. D'abord, ce que les fiscalistes appellent une clause de grand-père. Un pacte signé est un contrat, et un contrat oblige les deux parties. Les familles tiennent huit ans ; l'État tient les règles en vigueur au jour de la signature, jusqu'au terme. Cela ne coûte rien au budget. Pour les pactes nouveaux, la loi fixe ses conditions et le taux de 75 % est maintenu. Ensuite, achever le ciblage. La loi écarte désormais de l'exonération les résidences, les yachts ou les œuvres d'art logés dans les sociétés. Elle ne dit toujours rien de la trésorerie de placement ni de l'immobilier de rapport. Le même mécanisme, étendu à ces actifs, donnerait au régime sa forme aboutie, 75 % sans plafond pour l'outil professionnel, rien pour le reste. Ce ciblage rapporterait plus qu'un rabot. Et une évaluation publique tous les trois ans, chiffres sur la table, seule occasion de retoucher le régime. Entre deux rendez-vous, le régime ne bouge pas.</w:t>
+        <w:t xml:space="preserve">Que faire ? Il ne faut ni raboter ni sanctuariser. Le rabot punirait les PME sans fermer un seul montage ; le statu quo laisserait prospérer ce que la Cour documente. D'abord, ce que les fiscalistes appellent une clause de grand-père. Un pacte signé est un contrat, et un contrat oblige les deux parties. Les familles tiennent huit ans ; l'État tient les règles en vigueur au jour de la signature, jusqu'au terme. Cela ne coûte rien au budget. Pour les pactes nouveaux, la loi fixe ses conditions et le taux de 75 % est maintenu. Ensuite, achever le ciblage. Les biens de confort viennent de sortir de l'assiette. La trésorerie de placement et l'immobilier de rapport y restent. Le même mécanisme, étendu à ces actifs, donnerait au régime sa forme aboutie, 75 % sans plafond pour l'outil professionnel, rien pour le reste. Ce ciblage rapporterait plus qu'un rabot. Et une évaluation publique tous les trois ans, chiffres sur la table, seule occasion de retoucher le régime. Entre deux rendez-vous, le régime ne bouge pas.</w:t>
       </w:r>
     </w:p>
     <w:p>

</xml_diff>